<commit_message>
Ajustes reportes de fianzas
</commit_message>
<xml_diff>
--- a/Reportes/Factura_Construccion_AXX1977.docx
+++ b/Reportes/Factura_Construccion_AXX1977.docx
@@ -121,7 +121,45 @@
                 <w:sz w:val="16"/>
                 <w:szCs w:val="16"/>
               </w:rPr>
-              <w:t>Fianza de Gar. Cumplimiento Obras Gobierno</w:t>
+              <w:t xml:space="preserve">Fianza de </w:t>
+            </w:r>
+            <w:r>
+              <w:rPr>
+                <w:rFonts w:ascii="Arial" w:hAnsi="Arial"/>
+                <w:b/>
+                <w:sz w:val="16"/>
+                <w:szCs w:val="16"/>
+              </w:rPr>
+              <w:t>{</w:t>
+            </w:r>
+            <w:proofErr w:type="spellStart"/>
+            <w:r>
+              <w:rPr>
+                <w:rFonts w:ascii="Arial" w:hAnsi="Arial"/>
+                <w:b/>
+                <w:sz w:val="16"/>
+                <w:szCs w:val="16"/>
+              </w:rPr>
+              <w:t>custom.</w:t>
+            </w:r>
+            <w:r>
+              <w:rPr>
+                <w:rFonts w:ascii="Arial" w:hAnsi="Arial"/>
+                <w:b/>
+                <w:sz w:val="16"/>
+                <w:szCs w:val="16"/>
+              </w:rPr>
+              <w:t>NombreProducto</w:t>
+            </w:r>
+            <w:proofErr w:type="spellEnd"/>
+            <w:r>
+              <w:rPr>
+                <w:rFonts w:ascii="Arial" w:hAnsi="Arial"/>
+                <w:b/>
+                <w:sz w:val="16"/>
+                <w:szCs w:val="16"/>
+              </w:rPr>
+              <w:t>}</w:t>
             </w:r>
           </w:p>
         </w:tc>
@@ -144,7 +182,6 @@
               <w:t>Fianza: {</w:t>
             </w:r>
             <w:proofErr w:type="spellStart"/>
-            <w:proofErr w:type="gramStart"/>
             <w:r>
               <w:rPr>
                 <w:rFonts w:ascii="Arial" w:hAnsi="Arial"/>
@@ -154,7 +191,6 @@
               <w:t>custom.NumeroFianza</w:t>
             </w:r>
             <w:proofErr w:type="spellEnd"/>
-            <w:proofErr w:type="gramEnd"/>
             <w:r>
               <w:rPr>
                 <w:rFonts w:ascii="Arial" w:hAnsi="Arial"/>
@@ -179,7 +215,6 @@
               <w:t>{</w:t>
             </w:r>
             <w:proofErr w:type="spellStart"/>
-            <w:proofErr w:type="gramStart"/>
             <w:r>
               <w:rPr>
                 <w:rFonts w:ascii="Arial" w:hAnsi="Arial"/>
@@ -189,7 +224,6 @@
               <w:t>custom.TipoMovimientoFactura</w:t>
             </w:r>
             <w:proofErr w:type="spellEnd"/>
-            <w:proofErr w:type="gramEnd"/>
             <w:r>
               <w:rPr>
                 <w:rFonts w:ascii="Arial" w:hAnsi="Arial"/>
@@ -267,7 +301,6 @@
               <w:t xml:space="preserve"> {</w:t>
             </w:r>
             <w:proofErr w:type="spellStart"/>
-            <w:proofErr w:type="gramStart"/>
             <w:r>
               <w:rPr>
                 <w:rFonts w:ascii="Arial" w:hAnsi="Arial"/>
@@ -277,7 +310,6 @@
               <w:t>custom.Tenedor</w:t>
             </w:r>
             <w:proofErr w:type="spellEnd"/>
-            <w:proofErr w:type="gramEnd"/>
             <w:r>
               <w:rPr>
                 <w:rFonts w:ascii="Arial" w:hAnsi="Arial"/>
@@ -293,7 +325,6 @@
               <w:spacing w:after="100"/>
             </w:pPr>
             <w:proofErr w:type="spellStart"/>
-            <w:proofErr w:type="gramStart"/>
             <w:r>
               <w:rPr>
                 <w:rFonts w:ascii="Arial" w:hAnsi="Arial"/>
@@ -311,17 +342,7 @@
                 <w:sz w:val="16"/>
                 <w:szCs w:val="16"/>
               </w:rPr>
-              <w:t>./</w:t>
-            </w:r>
-            <w:proofErr w:type="gramEnd"/>
-            <w:r>
-              <w:rPr>
-                <w:rFonts w:ascii="Arial" w:hAnsi="Arial"/>
-                <w:b/>
-                <w:sz w:val="16"/>
-                <w:szCs w:val="16"/>
-              </w:rPr>
-              <w:t>R.U.C:</w:t>
+              <w:t>./R.U.C:</w:t>
             </w:r>
             <w:r>
               <w:rPr>
@@ -373,7 +394,6 @@
               <w:t xml:space="preserve"> {</w:t>
             </w:r>
             <w:proofErr w:type="spellStart"/>
-            <w:proofErr w:type="gramStart"/>
             <w:r>
               <w:rPr>
                 <w:rFonts w:ascii="Arial" w:hAnsi="Arial"/>
@@ -383,7 +403,6 @@
               <w:t>custom.DireccionTenedor</w:t>
             </w:r>
             <w:proofErr w:type="spellEnd"/>
-            <w:proofErr w:type="gramEnd"/>
             <w:r>
               <w:rPr>
                 <w:rFonts w:ascii="Arial" w:hAnsi="Arial"/>
@@ -416,7 +435,6 @@
               <w:t xml:space="preserve"> {</w:t>
             </w:r>
             <w:proofErr w:type="spellStart"/>
-            <w:proofErr w:type="gramStart"/>
             <w:r>
               <w:rPr>
                 <w:rFonts w:ascii="Arial" w:hAnsi="Arial"/>
@@ -426,7 +444,6 @@
               <w:t>custom.TelefonoTenedor</w:t>
             </w:r>
             <w:proofErr w:type="spellEnd"/>
-            <w:proofErr w:type="gramEnd"/>
             <w:r>
               <w:rPr>
                 <w:rFonts w:ascii="Arial" w:hAnsi="Arial"/>
@@ -462,7 +479,6 @@
               <w:t xml:space="preserve"> {</w:t>
             </w:r>
             <w:proofErr w:type="spellStart"/>
-            <w:proofErr w:type="gramStart"/>
             <w:r>
               <w:rPr>
                 <w:rFonts w:ascii="Arial" w:hAnsi="Arial"/>
@@ -472,7 +488,6 @@
               <w:t>custom.FaxTenedor</w:t>
             </w:r>
             <w:proofErr w:type="spellEnd"/>
-            <w:proofErr w:type="gramEnd"/>
             <w:r>
               <w:rPr>
                 <w:rFonts w:ascii="Arial" w:hAnsi="Arial"/>
@@ -551,7 +566,6 @@
               <w:t xml:space="preserve"> {</w:t>
             </w:r>
             <w:proofErr w:type="spellStart"/>
-            <w:proofErr w:type="gramStart"/>
             <w:r>
               <w:rPr>
                 <w:rFonts w:ascii="Arial" w:hAnsi="Arial"/>
@@ -561,7 +575,6 @@
               <w:t>custom.PaisTenedor</w:t>
             </w:r>
             <w:proofErr w:type="spellEnd"/>
-            <w:proofErr w:type="gramEnd"/>
             <w:r>
               <w:rPr>
                 <w:rFonts w:ascii="Arial" w:hAnsi="Arial"/>
@@ -640,7 +653,6 @@
               <w:t xml:space="preserve"> {</w:t>
             </w:r>
             <w:proofErr w:type="spellStart"/>
-            <w:proofErr w:type="gramStart"/>
             <w:r>
               <w:rPr>
                 <w:rFonts w:ascii="Arial" w:hAnsi="Arial"/>
@@ -650,7 +662,6 @@
               <w:t>custom.CiudadTenedor</w:t>
             </w:r>
             <w:proofErr w:type="spellEnd"/>
-            <w:proofErr w:type="gramEnd"/>
             <w:r>
               <w:rPr>
                 <w:rFonts w:ascii="Arial" w:hAnsi="Arial"/>
@@ -794,7 +805,6 @@
               <w:t>{</w:t>
             </w:r>
             <w:proofErr w:type="spellStart"/>
-            <w:proofErr w:type="gramStart"/>
             <w:r>
               <w:rPr>
                 <w:rFonts w:ascii="Arial" w:hAnsi="Arial"/>
@@ -804,7 +814,6 @@
               <w:t>custom.Desde</w:t>
             </w:r>
             <w:proofErr w:type="spellEnd"/>
-            <w:proofErr w:type="gramEnd"/>
             <w:r>
               <w:rPr>
                 <w:rFonts w:ascii="Arial" w:hAnsi="Arial"/>
@@ -849,7 +858,6 @@
               <w:t>{</w:t>
             </w:r>
             <w:proofErr w:type="spellStart"/>
-            <w:proofErr w:type="gramStart"/>
             <w:r>
               <w:rPr>
                 <w:rFonts w:ascii="Arial" w:hAnsi="Arial"/>
@@ -859,7 +867,6 @@
               <w:t>custom.Hasta</w:t>
             </w:r>
             <w:proofErr w:type="spellEnd"/>
-            <w:proofErr w:type="gramEnd"/>
             <w:r>
               <w:rPr>
                 <w:rFonts w:ascii="Arial" w:hAnsi="Arial"/>
@@ -954,7 +961,6 @@
               <w:t xml:space="preserve"> {</w:t>
             </w:r>
             <w:proofErr w:type="spellStart"/>
-            <w:proofErr w:type="gramStart"/>
             <w:r>
               <w:rPr>
                 <w:rFonts w:ascii="Arial" w:hAnsi="Arial"/>
@@ -964,7 +970,6 @@
               <w:t>custom.Corredor</w:t>
             </w:r>
             <w:proofErr w:type="spellEnd"/>
-            <w:proofErr w:type="gramEnd"/>
             <w:r>
               <w:rPr>
                 <w:rFonts w:ascii="Arial" w:hAnsi="Arial"/>
@@ -1072,7 +1077,6 @@
               <w:t xml:space="preserve"> {</w:t>
             </w:r>
             <w:proofErr w:type="spellStart"/>
-            <w:proofErr w:type="gramStart"/>
             <w:r>
               <w:rPr>
                 <w:rFonts w:ascii="Arial" w:hAnsi="Arial"/>
@@ -1082,22 +1086,13 @@
               <w:t>custom.AFavor</w:t>
             </w:r>
             <w:proofErr w:type="spellEnd"/>
-            <w:proofErr w:type="gramEnd"/>
-            <w:r>
-              <w:rPr>
-                <w:rFonts w:ascii="Arial" w:hAnsi="Arial"/>
-                <w:sz w:val="16"/>
-                <w:szCs w:val="16"/>
-              </w:rPr>
-              <w:t>}</w:t>
-            </w:r>
-            <w:r>
-              <w:rPr>
-                <w:rFonts w:ascii="Arial" w:hAnsi="Arial"/>
-                <w:sz w:val="16"/>
-                <w:szCs w:val="16"/>
-              </w:rPr>
-              <w:t xml:space="preserve">    </w:t>
+            <w:r>
+              <w:rPr>
+                <w:rFonts w:ascii="Arial" w:hAnsi="Arial"/>
+                <w:sz w:val="16"/>
+                <w:szCs w:val="16"/>
+              </w:rPr>
+              <w:t xml:space="preserve">}    </w:t>
             </w:r>
             <w:proofErr w:type="spellStart"/>
             <w:r>
@@ -1186,7 +1181,6 @@
               <w:t xml:space="preserve"> {</w:t>
             </w:r>
             <w:proofErr w:type="spellStart"/>
-            <w:proofErr w:type="gramStart"/>
             <w:r>
               <w:rPr>
                 <w:rFonts w:ascii="Arial" w:hAnsi="Arial"/>
@@ -1196,7 +1190,6 @@
               <w:t>custom.Suma</w:t>
             </w:r>
             <w:proofErr w:type="spellEnd"/>
-            <w:proofErr w:type="gramEnd"/>
             <w:r>
               <w:rPr>
                 <w:rFonts w:ascii="Arial" w:hAnsi="Arial"/>
@@ -1246,7 +1239,6 @@
               <w:t xml:space="preserve"> {</w:t>
             </w:r>
             <w:proofErr w:type="spellStart"/>
-            <w:proofErr w:type="gramStart"/>
             <w:r>
               <w:rPr>
                 <w:rFonts w:ascii="Arial" w:hAnsi="Arial"/>
@@ -1256,7 +1248,6 @@
               <w:t>custom.NumeroContrato</w:t>
             </w:r>
             <w:proofErr w:type="spellEnd"/>
-            <w:proofErr w:type="gramEnd"/>
             <w:r>
               <w:rPr>
                 <w:rFonts w:ascii="Arial" w:hAnsi="Arial"/>
@@ -1306,7 +1297,6 @@
               <w:t xml:space="preserve"> {</w:t>
             </w:r>
             <w:proofErr w:type="spellStart"/>
-            <w:proofErr w:type="gramStart"/>
             <w:r>
               <w:rPr>
                 <w:rFonts w:ascii="Arial" w:hAnsi="Arial"/>
@@ -1316,7 +1306,6 @@
               <w:t>custom.Licitacion</w:t>
             </w:r>
             <w:proofErr w:type="spellEnd"/>
-            <w:proofErr w:type="gramEnd"/>
             <w:r>
               <w:rPr>
                 <w:rFonts w:ascii="Arial" w:hAnsi="Arial"/>
@@ -1366,7 +1355,6 @@
               <w:t xml:space="preserve"> {</w:t>
             </w:r>
             <w:proofErr w:type="spellStart"/>
-            <w:proofErr w:type="gramStart"/>
             <w:r>
               <w:rPr>
                 <w:rFonts w:ascii="Arial" w:hAnsi="Arial"/>
@@ -1376,7 +1364,6 @@
               <w:t>custom.Descripcion</w:t>
             </w:r>
             <w:proofErr w:type="spellEnd"/>
-            <w:proofErr w:type="gramEnd"/>
             <w:r>
               <w:rPr>
                 <w:rFonts w:ascii="Arial" w:hAnsi="Arial"/>
@@ -2022,27 +2009,7 @@
                 <w:spacing w:val="-5"/>
                 <w:sz w:val="16"/>
               </w:rPr>
-              <w:t>{#</w:t>
-            </w:r>
-            <w:proofErr w:type="gramStart"/>
-            <w:r>
-              <w:rPr>
-                <w:rFonts w:ascii="Arial" w:hAnsi="Arial"/>
-                <w:bCs/>
-                <w:spacing w:val="-5"/>
-                <w:sz w:val="16"/>
-              </w:rPr>
-              <w:t>custom}{</w:t>
-            </w:r>
-            <w:proofErr w:type="gramEnd"/>
-            <w:r>
-              <w:rPr>
-                <w:rFonts w:ascii="Arial" w:hAnsi="Arial"/>
-                <w:bCs/>
-                <w:spacing w:val="-5"/>
-                <w:sz w:val="16"/>
-              </w:rPr>
-              <w:t>#Coberturas}{Cobertura}</w:t>
+              <w:t>{#custom}{#Coberturas}{Cobertura}</w:t>
             </w:r>
           </w:p>
         </w:tc>
@@ -2067,27 +2034,7 @@
                 <w:spacing w:val="-5"/>
                 <w:sz w:val="16"/>
               </w:rPr>
-              <w:t>{Limite</w:t>
-            </w:r>
-            <w:proofErr w:type="gramStart"/>
-            <w:r>
-              <w:rPr>
-                <w:rFonts w:ascii="Arial" w:hAnsi="Arial"/>
-                <w:bCs/>
-                <w:spacing w:val="-5"/>
-                <w:sz w:val="16"/>
-              </w:rPr>
-              <w:t>}{</w:t>
-            </w:r>
-            <w:proofErr w:type="gramEnd"/>
-            <w:r>
-              <w:rPr>
-                <w:rFonts w:ascii="Arial" w:hAnsi="Arial"/>
-                <w:bCs/>
-                <w:spacing w:val="-5"/>
-                <w:sz w:val="16"/>
-              </w:rPr>
-              <w:t>/}{/}</w:t>
+              <w:t>{Limite}{/}{/}</w:t>
             </w:r>
           </w:p>
         </w:tc>
@@ -2270,7 +2217,6 @@
                     <w:t>{</w:t>
                   </w:r>
                   <w:proofErr w:type="spellStart"/>
-                  <w:proofErr w:type="gramStart"/>
                   <w:r>
                     <w:rPr>
                       <w:rFonts w:ascii="Arial" w:hAnsi="Arial"/>
@@ -2280,7 +2226,6 @@
                     <w:t>custom.Prima</w:t>
                   </w:r>
                   <w:proofErr w:type="spellEnd"/>
-                  <w:proofErr w:type="gramEnd"/>
                   <w:r>
                     <w:rPr>
                       <w:rFonts w:ascii="Arial" w:hAnsi="Arial"/>
@@ -2335,7 +2280,6 @@
                     <w:t>{</w:t>
                   </w:r>
                   <w:proofErr w:type="spellStart"/>
-                  <w:proofErr w:type="gramStart"/>
                   <w:r>
                     <w:rPr>
                       <w:rFonts w:ascii="Arial" w:hAnsi="Arial"/>
@@ -2345,7 +2289,6 @@
                     <w:t>custom.Gastos</w:t>
                   </w:r>
                   <w:proofErr w:type="spellEnd"/>
-                  <w:proofErr w:type="gramEnd"/>
                   <w:r>
                     <w:rPr>
                       <w:rFonts w:ascii="Arial" w:hAnsi="Arial"/>
@@ -2400,7 +2343,6 @@
                     <w:t>{</w:t>
                   </w:r>
                   <w:proofErr w:type="spellStart"/>
-                  <w:proofErr w:type="gramStart"/>
                   <w:r>
                     <w:rPr>
                       <w:rFonts w:ascii="Arial" w:hAnsi="Arial"/>
@@ -2410,7 +2352,6 @@
                     <w:t>custom.Impuestos</w:t>
                   </w:r>
                   <w:proofErr w:type="spellEnd"/>
-                  <w:proofErr w:type="gramEnd"/>
                   <w:r>
                     <w:rPr>
                       <w:rFonts w:ascii="Arial" w:hAnsi="Arial"/>
@@ -2466,7 +2407,6 @@
                     <w:t>{</w:t>
                   </w:r>
                   <w:proofErr w:type="spellStart"/>
-                  <w:proofErr w:type="gramStart"/>
                   <w:r>
                     <w:rPr>
                       <w:rFonts w:ascii="Arial" w:hAnsi="Arial"/>
@@ -2476,7 +2416,6 @@
                     <w:t>custom.Total</w:t>
                   </w:r>
                   <w:proofErr w:type="spellEnd"/>
-                  <w:proofErr w:type="gramEnd"/>
                   <w:r>
                     <w:rPr>
                       <w:rFonts w:ascii="Arial" w:hAnsi="Arial"/>
@@ -2613,7 +2552,6 @@
         <w:t>Firmado en Panamá, R. de Panamá {</w:t>
       </w:r>
       <w:proofErr w:type="spellStart"/>
-      <w:proofErr w:type="gramStart"/>
       <w:r>
         <w:rPr>
           <w:rFonts w:ascii="Arial" w:hAnsi="Arial"/>
@@ -2623,7 +2561,6 @@
         <w:t>custom.FechaActualFactura</w:t>
       </w:r>
       <w:proofErr w:type="spellEnd"/>
-      <w:proofErr w:type="gramEnd"/>
       <w:r>
         <w:rPr>
           <w:rFonts w:ascii="Arial" w:hAnsi="Arial"/>
@@ -2735,7 +2672,6 @@
               <w:t>{</w:t>
             </w:r>
             <w:proofErr w:type="spellStart"/>
-            <w:proofErr w:type="gramStart"/>
             <w:r>
               <w:rPr>
                 <w:rFonts w:ascii="Arial" w:hAnsi="Arial"/>
@@ -2745,7 +2681,6 @@
               <w:t>custom.Tenedor</w:t>
             </w:r>
             <w:proofErr w:type="spellEnd"/>
-            <w:proofErr w:type="gramEnd"/>
             <w:r>
               <w:rPr>
                 <w:rFonts w:ascii="Arial" w:hAnsi="Arial"/>
@@ -3445,6 +3380,7 @@
   <w:style w:type="character" w:default="1" w:styleId="Fuentedeprrafopredeter">
     <w:name w:val="Default Paragraph Font"/>
     <w:uiPriority w:val="1"/>
+    <w:semiHidden/>
     <w:unhideWhenUsed/>
   </w:style>
   <w:style w:type="table" w:default="1" w:styleId="Tablanormal">

</xml_diff>